<commit_message>
Update project report documentation
</commit_message>
<xml_diff>
--- a/Project Report - Updated.docx
+++ b/Project Report - Updated.docx
@@ -335,16 +335,6 @@
           <w:szCs w:val="28"/>
         </w:rPr>
         <w:t>-202</w:t>
-      </w:r>
-      <w:r>
-        <w:rPr>
-          <w:rFonts w:ascii="Times New Roman" w:eastAsia="Times New Roman" w:hAnsi="Times New Roman" w:cs="Times New Roman"/>
-          <w:b/>
-          <w:bCs/>
-          <w:sz w:val="28"/>
-          <w:szCs w:val="28"/>
-        </w:rPr>
-        <w:t>5</w:t>
       </w:r>
       <w:r>
         <w:rPr>
@@ -1716,6 +1706,7 @@
               <w:rPr>
                 <w:i/>
                 <w:iCs/>
+                <w:noProof/>
                 <w:color w:val="999999"/>
                 <w:sz w:val="20"/>
                 <w:szCs w:val="20"/>
@@ -1824,6 +1815,9 @@
               <w:jc w:val="center"/>
             </w:pPr>
             <w:r>
+              <w:rPr>
+                <w:noProof/>
+              </w:rPr>
               <w:drawing>
                 <wp:inline distT="0" distB="0" distL="0" distR="0" wp14:anchorId="1DBD0362" wp14:editId="718BB361">
                   <wp:extent cx="3589684" cy="2164197"/>
@@ -1935,6 +1929,9 @@
               <w:jc w:val="center"/>
             </w:pPr>
             <w:r>
+              <w:rPr>
+                <w:noProof/>
+              </w:rPr>
               <w:drawing>
                 <wp:inline distT="0" distB="0" distL="0" distR="0" wp14:anchorId="33F0037C" wp14:editId="7E0A7F96">
                   <wp:extent cx="4384883" cy="2842054"/>
@@ -2043,6 +2040,7 @@
               <w:rPr>
                 <w:i/>
                 <w:iCs/>
+                <w:noProof/>
                 <w:color w:val="999999"/>
                 <w:sz w:val="20"/>
                 <w:szCs w:val="20"/>
@@ -2155,6 +2153,7 @@
               <w:rPr>
                 <w:i/>
                 <w:iCs/>
+                <w:noProof/>
                 <w:color w:val="999999"/>
                 <w:sz w:val="20"/>
                 <w:szCs w:val="20"/>
@@ -2274,6 +2273,9 @@
               <w:jc w:val="center"/>
             </w:pPr>
             <w:r>
+              <w:rPr>
+                <w:noProof/>
+              </w:rPr>
               <w:drawing>
                 <wp:inline distT="0" distB="0" distL="0" distR="0" wp14:anchorId="640DA583" wp14:editId="7A936DA0">
                   <wp:extent cx="5486400" cy="3690620"/>
@@ -2378,6 +2380,9 @@
               <w:jc w:val="center"/>
             </w:pPr>
             <w:r>
+              <w:rPr>
+                <w:noProof/>
+              </w:rPr>
               <w:drawing>
                 <wp:inline distT="0" distB="0" distL="0" distR="0" wp14:anchorId="3A496985" wp14:editId="2D61E12B">
                   <wp:extent cx="4763165" cy="2048161"/>

</xml_diff>